<commit_message>
new climate extreme analysis
redid climate extreme analysis with historical climate, fixed some code, started to work on robustness analysis for gap which was lost for some reason
</commit_message>
<xml_diff>
--- a/Climate effects on seasonal community transitions_2_9.docx
+++ b/Climate effects on seasonal community transitions_2_9.docx
@@ -6555,13 +6555,17 @@
       <w:r>
         <w:rPr>
           <w:rFonts w:ascii="Times New Roman" w:hAnsi="Times New Roman" w:cs="Times New Roman"/>
+          <w:b/>
+          <w:bCs/>
+          <w:i/>
+          <w:iCs/>
           <w:noProof/>
         </w:rPr>
         <w:drawing>
-          <wp:inline distT="0" distB="0" distL="0" distR="0" wp14:anchorId="25EC7A26" wp14:editId="0A80911E">
+          <wp:inline distT="0" distB="0" distL="0" distR="0" wp14:anchorId="39AF3F5D" wp14:editId="6AF93C97">
             <wp:extent cx="5943600" cy="2971800"/>
             <wp:effectExtent l="0" t="0" r="0" b="0"/>
-            <wp:docPr id="2040850340" name="Picture 6"/>
+            <wp:docPr id="27059738" name="Picture 3"/>
             <wp:cNvGraphicFramePr>
               <a:graphicFrameLocks xmlns:a="http://schemas.openxmlformats.org/drawingml/2006/main" noChangeAspect="1"/>
             </wp:cNvGraphicFramePr>
@@ -6569,7 +6573,7 @@
               <a:graphicData uri="http://schemas.openxmlformats.org/drawingml/2006/picture">
                 <pic:pic xmlns:pic="http://schemas.openxmlformats.org/drawingml/2006/picture">
                   <pic:nvPicPr>
-                    <pic:cNvPr id="2040850340" name="Picture 2040850340"/>
+                    <pic:cNvPr id="27059738" name="Picture 27059738"/>
                     <pic:cNvPicPr/>
                   </pic:nvPicPr>
                   <pic:blipFill>
@@ -7104,7 +7108,45 @@
         <w:rPr>
           <w:rFonts w:ascii="Times New Roman" w:hAnsi="Times New Roman" w:cs="Times New Roman"/>
         </w:rPr>
-        <w:t>). Unusually hot years triggered a shift toward significantly fewer and more bursty (temporally clustered) transitions between community states but did not significantly alter other network metrics (</w:t>
+        <w:t xml:space="preserve">). Unusually hot years triggered a shift toward </w:t>
+      </w:r>
+      <w:r>
+        <w:rPr>
+          <w:rFonts w:ascii="Times New Roman" w:hAnsi="Times New Roman" w:cs="Times New Roman"/>
+        </w:rPr>
+        <w:t xml:space="preserve">more </w:t>
+      </w:r>
+      <w:r>
+        <w:rPr>
+          <w:rFonts w:ascii="Times New Roman" w:hAnsi="Times New Roman" w:cs="Times New Roman"/>
+        </w:rPr>
+        <w:t xml:space="preserve">bursty (temporally clustered) transitions between community states </w:t>
+      </w:r>
+      <w:r>
+        <w:rPr>
+          <w:rFonts w:ascii="Times New Roman" w:hAnsi="Times New Roman" w:cs="Times New Roman"/>
+        </w:rPr>
+        <w:t>and resulted in a more “extreme” long node durations (higher skew</w:t>
+      </w:r>
+      <w:proofErr w:type="gramStart"/>
+      <w:r>
+        <w:rPr>
+          <w:rFonts w:ascii="Times New Roman" w:hAnsi="Times New Roman" w:cs="Times New Roman"/>
+        </w:rPr>
+        <w:t xml:space="preserve">), </w:t>
+      </w:r>
+      <w:r>
+        <w:rPr>
+          <w:rFonts w:ascii="Times New Roman" w:hAnsi="Times New Roman" w:cs="Times New Roman"/>
+        </w:rPr>
+        <w:t>but</w:t>
+      </w:r>
+      <w:proofErr w:type="gramEnd"/>
+      <w:r>
+        <w:rPr>
+          <w:rFonts w:ascii="Times New Roman" w:hAnsi="Times New Roman" w:cs="Times New Roman"/>
+        </w:rPr>
+        <w:t xml:space="preserve"> did not significantly alter other network metrics (</w:t>
       </w:r>
       <w:r>
         <w:rPr>
@@ -7131,13 +7173,15 @@
       <w:r>
         <w:rPr>
           <w:rFonts w:ascii="Times New Roman" w:hAnsi="Times New Roman" w:cs="Times New Roman"/>
+          <w:b/>
+          <w:bCs/>
           <w:noProof/>
         </w:rPr>
         <w:drawing>
-          <wp:inline distT="0" distB="0" distL="0" distR="0" wp14:anchorId="4E391BC5" wp14:editId="441C9C72">
+          <wp:inline distT="0" distB="0" distL="0" distR="0" wp14:anchorId="33E011DB" wp14:editId="64DB5EA7">
             <wp:extent cx="5943600" cy="2971800"/>
             <wp:effectExtent l="0" t="0" r="0" b="0"/>
-            <wp:docPr id="1017804655" name="Picture 7"/>
+            <wp:docPr id="997986471" name="Picture 2"/>
             <wp:cNvGraphicFramePr>
               <a:graphicFrameLocks xmlns:a="http://schemas.openxmlformats.org/drawingml/2006/main" noChangeAspect="1"/>
             </wp:cNvGraphicFramePr>
@@ -7145,7 +7189,7 @@
               <a:graphicData uri="http://schemas.openxmlformats.org/drawingml/2006/picture">
                 <pic:pic xmlns:pic="http://schemas.openxmlformats.org/drawingml/2006/picture">
                   <pic:nvPicPr>
-                    <pic:cNvPr id="1017804655" name="Picture 1017804655"/>
+                    <pic:cNvPr id="997986471" name="Picture 997986471"/>
                     <pic:cNvPicPr/>
                   </pic:nvPicPr>
                   <pic:blipFill>
@@ -7422,6 +7466,7 @@
         <w:rPr>
           <w:rFonts w:ascii="Times New Roman" w:hAnsi="Times New Roman" w:cs="Times New Roman"/>
         </w:rPr>
+        <w:lastRenderedPageBreak/>
         <w:t xml:space="preserve">~25% </w:t>
       </w:r>
       <w:r>
@@ -7458,26 +7503,13 @@
         <w:rPr>
           <w:rFonts w:ascii="Times New Roman" w:hAnsi="Times New Roman" w:cs="Times New Roman"/>
         </w:rPr>
-        <w:t xml:space="preserve">The drought-mediated reduction in network size was </w:t>
-      </w:r>
-      <w:r>
-        <w:rPr>
-          <w:rFonts w:ascii="Times New Roman" w:hAnsi="Times New Roman" w:cs="Times New Roman"/>
-        </w:rPr>
-        <w:lastRenderedPageBreak/>
-        <w:t xml:space="preserve">mostly driven by a loss of multi-species (three or more) states. However, this loss was independent of annual species diversity, which </w:t>
-      </w:r>
-      <w:r>
-        <w:rPr>
-          <w:rFonts w:ascii="Times New Roman" w:hAnsi="Times New Roman" w:cs="Times New Roman"/>
-        </w:rPr>
-        <w:t xml:space="preserve">dropped in extreme hot years by &lt;1 species (~8%, P=0.026, </w:t>
-      </w:r>
-      <w:r>
-        <w:rPr>
-          <w:rFonts w:ascii="Times New Roman" w:hAnsi="Times New Roman" w:cs="Times New Roman"/>
-        </w:rPr>
-        <w:t>χ</w:t>
+        <w:t xml:space="preserve">The drought-mediated reduction in network size was mostly driven by a loss of multi-species (three or more) states. However, this loss was independent of annual species diversity, which </w:t>
+      </w:r>
+      <w:r>
+        <w:rPr>
+          <w:rFonts w:ascii="Times New Roman" w:hAnsi="Times New Roman" w:cs="Times New Roman"/>
+        </w:rPr>
+        <w:t>remained stable across extreme hot (P=0.235, χ</w:t>
       </w:r>
       <w:r>
         <w:rPr>
@@ -7490,19 +7522,7 @@
         <w:rPr>
           <w:rFonts w:ascii="Times New Roman" w:hAnsi="Times New Roman" w:cs="Times New Roman"/>
         </w:rPr>
-        <w:t xml:space="preserve"> =4.95</w:t>
-      </w:r>
-      <w:r>
-        <w:rPr>
-          <w:rFonts w:ascii="Times New Roman" w:hAnsi="Times New Roman" w:cs="Times New Roman"/>
-        </w:rPr>
-        <w:t xml:space="preserve">) but </w:t>
-      </w:r>
-      <w:r>
-        <w:rPr>
-          <w:rFonts w:ascii="Times New Roman" w:hAnsi="Times New Roman" w:cs="Times New Roman"/>
-        </w:rPr>
-        <w:t xml:space="preserve">remained stable in dry </w:t>
+        <w:t xml:space="preserve"> =1.41) and dry </w:t>
       </w:r>
       <w:commentRangeStart w:id="7"/>
       <w:r>
@@ -7528,13 +7548,19 @@
         <w:rPr>
           <w:rFonts w:ascii="Times New Roman" w:hAnsi="Times New Roman" w:cs="Times New Roman"/>
         </w:rPr>
-        <w:t xml:space="preserve">(P=0.873, </w:t>
-      </w:r>
-      <w:r>
-        <w:rPr>
-          <w:rFonts w:ascii="Times New Roman" w:hAnsi="Times New Roman" w:cs="Times New Roman"/>
-        </w:rPr>
-        <w:t>χ</w:t>
+        <w:t>(P=0.</w:t>
+      </w:r>
+      <w:r>
+        <w:rPr>
+          <w:rFonts w:ascii="Times New Roman" w:hAnsi="Times New Roman" w:cs="Times New Roman"/>
+        </w:rPr>
+        <w:t>620</w:t>
+      </w:r>
+      <w:r>
+        <w:rPr>
+          <w:rFonts w:ascii="Times New Roman" w:hAnsi="Times New Roman" w:cs="Times New Roman"/>
+        </w:rPr>
+        <w:t>, χ</w:t>
       </w:r>
       <w:r>
         <w:rPr>
@@ -7547,13 +7573,19 @@
         <w:rPr>
           <w:rFonts w:ascii="Times New Roman" w:hAnsi="Times New Roman" w:cs="Times New Roman"/>
         </w:rPr>
-        <w:t xml:space="preserve"> =</w:t>
-      </w:r>
-      <w:r>
-        <w:rPr>
-          <w:rFonts w:ascii="Times New Roman" w:hAnsi="Times New Roman" w:cs="Times New Roman"/>
-        </w:rPr>
-        <w:t>0.03)</w:t>
+        <w:t xml:space="preserve"> =0.</w:t>
+      </w:r>
+      <w:r>
+        <w:rPr>
+          <w:rFonts w:ascii="Times New Roman" w:hAnsi="Times New Roman" w:cs="Times New Roman"/>
+        </w:rPr>
+        <w:t>25</w:t>
+      </w:r>
+      <w:r>
+        <w:rPr>
+          <w:rFonts w:ascii="Times New Roman" w:hAnsi="Times New Roman" w:cs="Times New Roman"/>
+        </w:rPr>
+        <w:t>)</w:t>
       </w:r>
       <w:r>
         <w:rPr>
@@ -12219,7 +12251,49 @@
         <w:rPr>
           <w:rFonts w:ascii="Times New Roman" w:hAnsi="Times New Roman" w:cs="Times New Roman"/>
         </w:rPr>
-        <w:t xml:space="preserve">) per cycle ranged from 8.59 -15.23ºC and 19.30-27.78ºC respectively, with 6-99 days above a maximum temperature of 35ºC per year, and cumulative precipitation from 758.7-1990.1. Finally, we identified years with extreme climatic events based on whether they fell outside the ±1 SD of the mean for a given metric. We created two different sets of extreme years based on temperature versus precipitation: extreme hot years (years with 1 SD above the average mean </w:t>
+        <w:t xml:space="preserve">) per cycle ranged from 8.59 -15.23ºC and 19.30-27.78ºC respectively, with 6-99 days above a maximum temperature of 35ºC per year, and cumulative precipitation from 758.7-1990.1. Finally, we identified years with </w:t>
+      </w:r>
+      <w:r>
+        <w:rPr>
+          <w:rFonts w:ascii="Times New Roman" w:hAnsi="Times New Roman" w:cs="Times New Roman"/>
+        </w:rPr>
+        <w:t>“</w:t>
+      </w:r>
+      <w:r>
+        <w:rPr>
+          <w:rFonts w:ascii="Times New Roman" w:hAnsi="Times New Roman" w:cs="Times New Roman"/>
+        </w:rPr>
+        <w:t>extreme</w:t>
+      </w:r>
+      <w:r>
+        <w:rPr>
+          <w:rFonts w:ascii="Times New Roman" w:hAnsi="Times New Roman" w:cs="Times New Roman"/>
+        </w:rPr>
+        <w:t>”</w:t>
+      </w:r>
+      <w:r>
+        <w:rPr>
+          <w:rFonts w:ascii="Times New Roman" w:hAnsi="Times New Roman" w:cs="Times New Roman"/>
+        </w:rPr>
+        <w:t xml:space="preserve"> climatic events </w:t>
+      </w:r>
+      <w:r>
+        <w:rPr>
+          <w:rFonts w:ascii="Times New Roman" w:hAnsi="Times New Roman" w:cs="Times New Roman"/>
+        </w:rPr>
+        <w:t>as those falling</w:t>
+      </w:r>
+      <w:r>
+        <w:rPr>
+          <w:rFonts w:ascii="Times New Roman" w:hAnsi="Times New Roman" w:cs="Times New Roman"/>
+        </w:rPr>
+        <w:t xml:space="preserve"> outside ±1 SD of the mean over the past 50 years for each</w:t>
+      </w:r>
+      <w:r>
+        <w:rPr>
+          <w:rFonts w:ascii="Times New Roman" w:hAnsi="Times New Roman" w:cs="Times New Roman"/>
+        </w:rPr>
+        <w:t xml:space="preserve"> metric. We created two different sets of extreme years based on temperature versus precipitation: extreme hot years (years with 1 SD above the average mean </w:t>
       </w:r>
       <w:proofErr w:type="spellStart"/>
       <w:r>
@@ -12240,43 +12314,79 @@
         <w:rPr>
           <w:rFonts w:ascii="Times New Roman" w:hAnsi="Times New Roman" w:cs="Times New Roman"/>
         </w:rPr>
+        <w:t>HotDays</w:t>
+      </w:r>
+      <w:proofErr w:type="spellEnd"/>
+      <w:r>
+        <w:rPr>
+          <w:rFonts w:ascii="Times New Roman" w:hAnsi="Times New Roman" w:cs="Times New Roman"/>
+        </w:rPr>
+        <w:t xml:space="preserve">) and extreme dry years (years with 1 SD below the average </w:t>
+      </w:r>
+      <w:proofErr w:type="spellStart"/>
+      <w:r>
+        <w:rPr>
+          <w:rFonts w:ascii="Times New Roman" w:hAnsi="Times New Roman" w:cs="Times New Roman"/>
+        </w:rPr>
+        <w:t>meanPrec</w:t>
+      </w:r>
+      <w:proofErr w:type="spellEnd"/>
+      <w:r>
+        <w:rPr>
+          <w:rFonts w:ascii="Times New Roman" w:hAnsi="Times New Roman" w:cs="Times New Roman"/>
+        </w:rPr>
+        <w:t xml:space="preserve"> or </w:t>
+      </w:r>
+      <w:r>
+        <w:rPr>
+          <w:rFonts w:ascii="Times New Roman" w:hAnsi="Times New Roman" w:cs="Times New Roman"/>
+        </w:rPr>
         <w:lastRenderedPageBreak/>
-        <w:t>HotDays</w:t>
+        <w:t xml:space="preserve">above the average number of </w:t>
+      </w:r>
+      <w:proofErr w:type="spellStart"/>
+      <w:r>
+        <w:rPr>
+          <w:rFonts w:ascii="Times New Roman" w:hAnsi="Times New Roman" w:cs="Times New Roman"/>
+        </w:rPr>
+        <w:t>DaysNoRain</w:t>
       </w:r>
       <w:proofErr w:type="spellEnd"/>
       <w:r>
         <w:rPr>
           <w:rFonts w:ascii="Times New Roman" w:hAnsi="Times New Roman" w:cs="Times New Roman"/>
         </w:rPr>
-        <w:t xml:space="preserve">) and extreme dry years (years with 1 SD below the average </w:t>
-      </w:r>
-      <w:proofErr w:type="spellStart"/>
-      <w:r>
-        <w:rPr>
-          <w:rFonts w:ascii="Times New Roman" w:hAnsi="Times New Roman" w:cs="Times New Roman"/>
-        </w:rPr>
-        <w:t>meanPrec</w:t>
-      </w:r>
-      <w:proofErr w:type="spellEnd"/>
-      <w:r>
-        <w:rPr>
-          <w:rFonts w:ascii="Times New Roman" w:hAnsi="Times New Roman" w:cs="Times New Roman"/>
-        </w:rPr>
-        <w:t xml:space="preserve"> or above the average number of </w:t>
-      </w:r>
-      <w:proofErr w:type="spellStart"/>
-      <w:r>
-        <w:rPr>
-          <w:rFonts w:ascii="Times New Roman" w:hAnsi="Times New Roman" w:cs="Times New Roman"/>
-        </w:rPr>
-        <w:t>DaysNoRain</w:t>
-      </w:r>
-      <w:proofErr w:type="spellEnd"/>
-      <w:r>
-        <w:rPr>
-          <w:rFonts w:ascii="Times New Roman" w:hAnsi="Times New Roman" w:cs="Times New Roman"/>
-        </w:rPr>
-        <w:t xml:space="preserve">).  </w:t>
+        <w:t xml:space="preserve">). </w:t>
+      </w:r>
+      <w:r>
+        <w:rPr>
+          <w:rFonts w:ascii="Times New Roman" w:hAnsi="Times New Roman" w:cs="Times New Roman"/>
+        </w:rPr>
+        <w:t>This approach ensured that we only picked the most extreme years during the study period, while providing enough statistical power to compare metrics across extreme vs normal years.</w:t>
+      </w:r>
+      <w:r>
+        <w:rPr>
+          <w:rFonts w:ascii="Times New Roman" w:hAnsi="Times New Roman" w:cs="Times New Roman"/>
+        </w:rPr>
+        <w:t xml:space="preserve"> Note that</w:t>
+      </w:r>
+      <w:r>
+        <w:rPr>
+          <w:rFonts w:ascii="Times New Roman" w:hAnsi="Times New Roman" w:cs="Times New Roman"/>
+        </w:rPr>
+        <w:t xml:space="preserve"> </w:t>
+      </w:r>
+      <w:r>
+        <w:rPr>
+          <w:rFonts w:ascii="Times New Roman" w:hAnsi="Times New Roman" w:cs="Times New Roman"/>
+        </w:rPr>
+        <w:t xml:space="preserve">this includes the 5 hottest years recorded in the past 100 years, and 5 driest years recorded in the past 50 years. Thus, the years represent true climate extremes. </w:t>
+      </w:r>
+      <w:r>
+        <w:rPr>
+          <w:rFonts w:ascii="Times New Roman" w:hAnsi="Times New Roman" w:cs="Times New Roman"/>
+        </w:rPr>
+        <w:t xml:space="preserve">  </w:t>
       </w:r>
       <w:r>
         <w:rPr>
@@ -13462,7 +13572,7 @@
         <mc:AlternateContent>
           <mc:Choice Requires="wpg">
             <w:drawing>
-              <wp:anchor distT="0" distB="0" distL="114300" distR="114300" simplePos="0" relativeHeight="251682816" behindDoc="0" locked="0" layoutInCell="1" allowOverlap="1" wp14:anchorId="7AD3513B" wp14:editId="57A5F2E0">
+              <wp:anchor distT="0" distB="0" distL="114300" distR="114300" simplePos="0" relativeHeight="251682816" behindDoc="0" locked="0" layoutInCell="1" allowOverlap="1" wp14:anchorId="7AD3513B" wp14:editId="061B927F">
                 <wp:simplePos x="0" y="0"/>
                 <wp:positionH relativeFrom="column">
                   <wp:posOffset>-14960</wp:posOffset>

</xml_diff>